<commit_message>
docs(prd): add mini app UI screenshots
</commit_message>
<xml_diff>
--- a/requirements/downloads/01_迷你仓选仓下单_PRD_V2.0.docx
+++ b/requirements/downloads/01_迷你仓选仓下单_PRD_V2.0.docx
@@ -1580,6 +1580,11 @@
       </w:r>
     </w:p>
     <w:p>
+      <w:r>
+        <w:t>本节界面截图依据页面字段、状态和操作规则生成，用于前端布局、接口联调和验收对照；截图中的业务数据为示例，权威值必须来自服务端。</w:t>
+      </w:r>
+    </w:p>
+    <w:p>
       <w:pPr>
         <w:pStyle w:val="Heading2"/>
       </w:pPr>
@@ -1899,6 +1904,61 @@
           <w:sz w:val="21"/>
         </w:rPr>
         <w:t>错误提示必须说明发生了什么、是否已生效和下一步可执行操作，不显示内部堆栈或第三方原始错误。</w:t>
+      </w:r>
+    </w:p>
+    <w:p>
+      <w:pPr>
+        <w:keepNext/>
+        <w:jc w:val="center"/>
+      </w:pPr>
+      <w:r>
+        <w:drawing>
+          <wp:inline xmlns:a="http://schemas.openxmlformats.org/drawingml/2006/main" xmlns:pic="http://schemas.openxmlformats.org/drawingml/2006/picture">
+            <wp:extent cx="2331720" cy="4147354"/>
+            <wp:docPr id="2" name="MP-ST-01 门店推荐列表与地图界面截图" descr="门店推荐列表与地图界面截图，展示主要字段、状态与操作"/>
+            <wp:cNvGraphicFramePr>
+              <a:graphicFrameLocks noChangeAspect="1"/>
+            </wp:cNvGraphicFramePr>
+            <a:graphic>
+              <a:graphicData uri="http://schemas.openxmlformats.org/drawingml/2006/picture">
+                <pic:pic>
+                  <pic:nvPicPr>
+                    <pic:cNvPr id="0" name="01-storage-booking-ui-01.png"/>
+                    <pic:cNvPicPr/>
+                  </pic:nvPicPr>
+                  <pic:blipFill>
+                    <a:blip r:embed="rId12"/>
+                    <a:stretch>
+                      <a:fillRect/>
+                    </a:stretch>
+                  </pic:blipFill>
+                  <pic:spPr>
+                    <a:xfrm>
+                      <a:off x="0" y="0"/>
+                      <a:ext cx="2331720" cy="4147354"/>
+                    </a:xfrm>
+                    <a:prstGeom prst="rect"/>
+                  </pic:spPr>
+                </pic:pic>
+              </a:graphicData>
+            </a:graphic>
+          </wp:inline>
+        </w:drawing>
+      </w:r>
+    </w:p>
+    <w:p>
+      <w:pPr>
+        <w:keepNext w:val="0"/>
+        <w:jc w:val="center"/>
+      </w:pPr>
+      <w:r>
+        <w:rPr>
+          <w:rFonts w:ascii="Arial" w:hAnsi="Arial" w:eastAsia="Microsoft YaHei"/>
+          <w:b w:val="0"/>
+          <w:color w:val="667085"/>
+          <w:sz w:val="17"/>
+        </w:rPr>
+        <w:t>图 4-1 门店推荐列表与地图界面截图</w:t>
       </w:r>
     </w:p>
     <w:p>
@@ -2225,6 +2285,61 @@
     </w:p>
     <w:p>
       <w:pPr>
+        <w:keepNext/>
+        <w:jc w:val="center"/>
+      </w:pPr>
+      <w:r>
+        <w:drawing>
+          <wp:inline xmlns:a="http://schemas.openxmlformats.org/drawingml/2006/main" xmlns:pic="http://schemas.openxmlformats.org/drawingml/2006/picture">
+            <wp:extent cx="2331720" cy="4147354"/>
+            <wp:docPr id="3" name="MP-ST-01 门店详情与VR界面截图" descr="门店详情与VR界面截图，展示主要字段、状态与操作"/>
+            <wp:cNvGraphicFramePr>
+              <a:graphicFrameLocks noChangeAspect="1"/>
+            </wp:cNvGraphicFramePr>
+            <a:graphic>
+              <a:graphicData uri="http://schemas.openxmlformats.org/drawingml/2006/picture">
+                <pic:pic>
+                  <pic:nvPicPr>
+                    <pic:cNvPr id="0" name="01-storage-booking-ui-02.png"/>
+                    <pic:cNvPicPr/>
+                  </pic:nvPicPr>
+                  <pic:blipFill>
+                    <a:blip r:embed="rId13"/>
+                    <a:stretch>
+                      <a:fillRect/>
+                    </a:stretch>
+                  </pic:blipFill>
+                  <pic:spPr>
+                    <a:xfrm>
+                      <a:off x="0" y="0"/>
+                      <a:ext cx="2331720" cy="4147354"/>
+                    </a:xfrm>
+                    <a:prstGeom prst="rect"/>
+                  </pic:spPr>
+                </pic:pic>
+              </a:graphicData>
+            </a:graphic>
+          </wp:inline>
+        </w:drawing>
+      </w:r>
+    </w:p>
+    <w:p>
+      <w:pPr>
+        <w:keepNext w:val="0"/>
+        <w:jc w:val="center"/>
+      </w:pPr>
+      <w:r>
+        <w:rPr>
+          <w:rFonts w:ascii="Arial" w:hAnsi="Arial" w:eastAsia="Microsoft YaHei"/>
+          <w:b w:val="0"/>
+          <w:color w:val="667085"/>
+          <w:sz w:val="17"/>
+        </w:rPr>
+        <w:t>图 4-2 门店详情与VR界面截图</w:t>
+      </w:r>
+    </w:p>
+    <w:p>
+      <w:pPr>
         <w:pStyle w:val="Heading2"/>
       </w:pPr>
       <w:r>
@@ -2543,6 +2658,61 @@
           <w:sz w:val="21"/>
         </w:rPr>
         <w:t>错误提示必须说明发生了什么、是否已生效和下一步可执行操作，不显示内部堆栈或第三方原始错误。</w:t>
+      </w:r>
+    </w:p>
+    <w:p>
+      <w:pPr>
+        <w:keepNext/>
+        <w:jc w:val="center"/>
+      </w:pPr>
+      <w:r>
+        <w:drawing>
+          <wp:inline xmlns:a="http://schemas.openxmlformats.org/drawingml/2006/main" xmlns:pic="http://schemas.openxmlformats.org/drawingml/2006/picture">
+            <wp:extent cx="2331720" cy="4147354"/>
+            <wp:docPr id="4" name="MP-ST-01 仓位选择界面截图" descr="仓位选择界面截图，展示主要字段、状态与操作"/>
+            <wp:cNvGraphicFramePr>
+              <a:graphicFrameLocks noChangeAspect="1"/>
+            </wp:cNvGraphicFramePr>
+            <a:graphic>
+              <a:graphicData uri="http://schemas.openxmlformats.org/drawingml/2006/picture">
+                <pic:pic>
+                  <pic:nvPicPr>
+                    <pic:cNvPr id="0" name="01-storage-booking-ui-03.png"/>
+                    <pic:cNvPicPr/>
+                  </pic:nvPicPr>
+                  <pic:blipFill>
+                    <a:blip r:embed="rId14"/>
+                    <a:stretch>
+                      <a:fillRect/>
+                    </a:stretch>
+                  </pic:blipFill>
+                  <pic:spPr>
+                    <a:xfrm>
+                      <a:off x="0" y="0"/>
+                      <a:ext cx="2331720" cy="4147354"/>
+                    </a:xfrm>
+                    <a:prstGeom prst="rect"/>
+                  </pic:spPr>
+                </pic:pic>
+              </a:graphicData>
+            </a:graphic>
+          </wp:inline>
+        </w:drawing>
+      </w:r>
+    </w:p>
+    <w:p>
+      <w:pPr>
+        <w:keepNext w:val="0"/>
+        <w:jc w:val="center"/>
+      </w:pPr>
+      <w:r>
+        <w:rPr>
+          <w:rFonts w:ascii="Arial" w:hAnsi="Arial" w:eastAsia="Microsoft YaHei"/>
+          <w:b w:val="0"/>
+          <w:color w:val="667085"/>
+          <w:sz w:val="17"/>
+        </w:rPr>
+        <w:t>图 4-3 仓位选择界面截图</w:t>
       </w:r>
     </w:p>
     <w:p>
@@ -2869,6 +3039,61 @@
     </w:p>
     <w:p>
       <w:pPr>
+        <w:keepNext/>
+        <w:jc w:val="center"/>
+      </w:pPr>
+      <w:r>
+        <w:drawing>
+          <wp:inline xmlns:a="http://schemas.openxmlformats.org/drawingml/2006/main" xmlns:pic="http://schemas.openxmlformats.org/drawingml/2006/picture">
+            <wp:extent cx="2331720" cy="4147354"/>
+            <wp:docPr id="5" name="MP-ST-01 订单确认与电子签约界面截图" descr="订单确认与电子签约界面截图，展示主要字段、状态与操作"/>
+            <wp:cNvGraphicFramePr>
+              <a:graphicFrameLocks noChangeAspect="1"/>
+            </wp:cNvGraphicFramePr>
+            <a:graphic>
+              <a:graphicData uri="http://schemas.openxmlformats.org/drawingml/2006/picture">
+                <pic:pic>
+                  <pic:nvPicPr>
+                    <pic:cNvPr id="0" name="01-storage-booking-ui-04.png"/>
+                    <pic:cNvPicPr/>
+                  </pic:nvPicPr>
+                  <pic:blipFill>
+                    <a:blip r:embed="rId15"/>
+                    <a:stretch>
+                      <a:fillRect/>
+                    </a:stretch>
+                  </pic:blipFill>
+                  <pic:spPr>
+                    <a:xfrm>
+                      <a:off x="0" y="0"/>
+                      <a:ext cx="2331720" cy="4147354"/>
+                    </a:xfrm>
+                    <a:prstGeom prst="rect"/>
+                  </pic:spPr>
+                </pic:pic>
+              </a:graphicData>
+            </a:graphic>
+          </wp:inline>
+        </w:drawing>
+      </w:r>
+    </w:p>
+    <w:p>
+      <w:pPr>
+        <w:keepNext w:val="0"/>
+        <w:jc w:val="center"/>
+      </w:pPr>
+      <w:r>
+        <w:rPr>
+          <w:rFonts w:ascii="Arial" w:hAnsi="Arial" w:eastAsia="Microsoft YaHei"/>
+          <w:b w:val="0"/>
+          <w:color w:val="667085"/>
+          <w:sz w:val="17"/>
+        </w:rPr>
+        <w:t>图 4-4 订单确认与电子签约界面截图</w:t>
+      </w:r>
+    </w:p>
+    <w:p>
+      <w:pPr>
         <w:pStyle w:val="Heading2"/>
       </w:pPr>
       <w:r>
@@ -3191,6 +3416,61 @@
     </w:p>
     <w:p>
       <w:pPr>
+        <w:keepNext/>
+        <w:jc w:val="center"/>
+      </w:pPr>
+      <w:r>
+        <w:drawing>
+          <wp:inline xmlns:a="http://schemas.openxmlformats.org/drawingml/2006/main" xmlns:pic="http://schemas.openxmlformats.org/drawingml/2006/picture">
+            <wp:extent cx="2331720" cy="4147354"/>
+            <wp:docPr id="6" name="MP-ST-01 保险与优惠确认界面截图" descr="保险与优惠确认界面截图，展示主要字段、状态与操作"/>
+            <wp:cNvGraphicFramePr>
+              <a:graphicFrameLocks noChangeAspect="1"/>
+            </wp:cNvGraphicFramePr>
+            <a:graphic>
+              <a:graphicData uri="http://schemas.openxmlformats.org/drawingml/2006/picture">
+                <pic:pic>
+                  <pic:nvPicPr>
+                    <pic:cNvPr id="0" name="01-storage-booking-ui-05.png"/>
+                    <pic:cNvPicPr/>
+                  </pic:nvPicPr>
+                  <pic:blipFill>
+                    <a:blip r:embed="rId16"/>
+                    <a:stretch>
+                      <a:fillRect/>
+                    </a:stretch>
+                  </pic:blipFill>
+                  <pic:spPr>
+                    <a:xfrm>
+                      <a:off x="0" y="0"/>
+                      <a:ext cx="2331720" cy="4147354"/>
+                    </a:xfrm>
+                    <a:prstGeom prst="rect"/>
+                  </pic:spPr>
+                </pic:pic>
+              </a:graphicData>
+            </a:graphic>
+          </wp:inline>
+        </w:drawing>
+      </w:r>
+    </w:p>
+    <w:p>
+      <w:pPr>
+        <w:keepNext w:val="0"/>
+        <w:jc w:val="center"/>
+      </w:pPr>
+      <w:r>
+        <w:rPr>
+          <w:rFonts w:ascii="Arial" w:hAnsi="Arial" w:eastAsia="Microsoft YaHei"/>
+          <w:b w:val="0"/>
+          <w:color w:val="667085"/>
+          <w:sz w:val="17"/>
+        </w:rPr>
+        <w:t>图 4-5 保险与优惠确认界面截图</w:t>
+      </w:r>
+    </w:p>
+    <w:p>
+      <w:pPr>
         <w:pStyle w:val="Heading2"/>
       </w:pPr>
       <w:r>
@@ -3509,6 +3789,61 @@
           <w:sz w:val="21"/>
         </w:rPr>
         <w:t>错误提示必须说明发生了什么、是否已生效和下一步可执行操作，不显示内部堆栈或第三方原始错误。</w:t>
+      </w:r>
+    </w:p>
+    <w:p>
+      <w:pPr>
+        <w:keepNext/>
+        <w:jc w:val="center"/>
+      </w:pPr>
+      <w:r>
+        <w:drawing>
+          <wp:inline xmlns:a="http://schemas.openxmlformats.org/drawingml/2006/main" xmlns:pic="http://schemas.openxmlformats.org/drawingml/2006/picture">
+            <wp:extent cx="2331720" cy="4147354"/>
+            <wp:docPr id="7" name="MP-ST-01 统一支付与结果界面截图" descr="统一支付与结果界面截图，展示主要字段、状态与操作"/>
+            <wp:cNvGraphicFramePr>
+              <a:graphicFrameLocks noChangeAspect="1"/>
+            </wp:cNvGraphicFramePr>
+            <a:graphic>
+              <a:graphicData uri="http://schemas.openxmlformats.org/drawingml/2006/picture">
+                <pic:pic>
+                  <pic:nvPicPr>
+                    <pic:cNvPr id="0" name="01-storage-booking-ui-06.png"/>
+                    <pic:cNvPicPr/>
+                  </pic:nvPicPr>
+                  <pic:blipFill>
+                    <a:blip r:embed="rId17"/>
+                    <a:stretch>
+                      <a:fillRect/>
+                    </a:stretch>
+                  </pic:blipFill>
+                  <pic:spPr>
+                    <a:xfrm>
+                      <a:off x="0" y="0"/>
+                      <a:ext cx="2331720" cy="4147354"/>
+                    </a:xfrm>
+                    <a:prstGeom prst="rect"/>
+                  </pic:spPr>
+                </pic:pic>
+              </a:graphicData>
+            </a:graphic>
+          </wp:inline>
+        </w:drawing>
+      </w:r>
+    </w:p>
+    <w:p>
+      <w:pPr>
+        <w:keepNext w:val="0"/>
+        <w:jc w:val="center"/>
+      </w:pPr>
+      <w:r>
+        <w:rPr>
+          <w:rFonts w:ascii="Arial" w:hAnsi="Arial" w:eastAsia="Microsoft YaHei"/>
+          <w:b w:val="0"/>
+          <w:color w:val="667085"/>
+          <w:sz w:val="17"/>
+        </w:rPr>
+        <w:t>图 4-6 统一支付与结果界面截图</w:t>
       </w:r>
     </w:p>
     <w:p>

</xml_diff>

<commit_message>
docs(prd): use real prototype screenshots
</commit_message>
<xml_diff>
--- a/requirements/downloads/01_迷你仓选仓下单_PRD_V2.0.docx
+++ b/requirements/downloads/01_迷你仓选仓下单_PRD_V2.0.docx
@@ -1581,7 +1581,7 @@
     </w:p>
     <w:p>
       <w:r>
-        <w:t>本节界面截图依据页面字段、状态和操作规则生成，用于前端布局、接口联调和验收对照；截图中的业务数据为示例，权威值必须来自服务端。</w:t>
+        <w:t>本节截图直接取自迷你仓小程序可交互原型的实际页面，用于前端布局、接口联调和验收对照。截图反映当前原型状态；业务权威值仍以服务端返回为准。</w:t>
       </w:r>
     </w:p>
     <w:p>
@@ -1914,8 +1914,8 @@
       <w:r>
         <w:drawing>
           <wp:inline xmlns:a="http://schemas.openxmlformats.org/drawingml/2006/main" xmlns:pic="http://schemas.openxmlformats.org/drawingml/2006/picture">
-            <wp:extent cx="2331720" cy="4147354"/>
-            <wp:docPr id="2" name="MP-ST-01 门店推荐列表与地图界面截图" descr="门店推荐列表与地图界面截图，展示主要字段、状态与操作"/>
+            <wp:extent cx="2331720" cy="4789479"/>
+            <wp:docPr id="2" name="MP-ST-01 门店推荐列表与地图原型真实界面截图" descr="从迷你仓小程序可交互原型截取的门店推荐列表与地图实际界面"/>
             <wp:cNvGraphicFramePr>
               <a:graphicFrameLocks noChangeAspect="1"/>
             </wp:cNvGraphicFramePr>
@@ -1935,7 +1935,7 @@
                   <pic:spPr>
                     <a:xfrm>
                       <a:off x="0" y="0"/>
-                      <a:ext cx="2331720" cy="4147354"/>
+                      <a:ext cx="2331720" cy="4789479"/>
                     </a:xfrm>
                     <a:prstGeom prst="rect"/>
                   </pic:spPr>
@@ -1958,7 +1958,7 @@
           <w:color w:val="667085"/>
           <w:sz w:val="17"/>
         </w:rPr>
-        <w:t>图 4-1 门店推荐列表与地图界面截图</w:t>
+        <w:t>图 4-1 门店推荐列表与地图原型真实界面截图</w:t>
       </w:r>
     </w:p>
     <w:p>
@@ -2291,8 +2291,8 @@
       <w:r>
         <w:drawing>
           <wp:inline xmlns:a="http://schemas.openxmlformats.org/drawingml/2006/main" xmlns:pic="http://schemas.openxmlformats.org/drawingml/2006/picture">
-            <wp:extent cx="2331720" cy="4147354"/>
-            <wp:docPr id="3" name="MP-ST-01 门店详情与VR界面截图" descr="门店详情与VR界面截图，展示主要字段、状态与操作"/>
+            <wp:extent cx="2331720" cy="4789479"/>
+            <wp:docPr id="3" name="MP-ST-01 门店详情与VR原型真实界面截图" descr="从迷你仓小程序可交互原型截取的门店详情与VR实际界面"/>
             <wp:cNvGraphicFramePr>
               <a:graphicFrameLocks noChangeAspect="1"/>
             </wp:cNvGraphicFramePr>
@@ -2312,7 +2312,7 @@
                   <pic:spPr>
                     <a:xfrm>
                       <a:off x="0" y="0"/>
-                      <a:ext cx="2331720" cy="4147354"/>
+                      <a:ext cx="2331720" cy="4789479"/>
                     </a:xfrm>
                     <a:prstGeom prst="rect"/>
                   </pic:spPr>
@@ -2335,7 +2335,7 @@
           <w:color w:val="667085"/>
           <w:sz w:val="17"/>
         </w:rPr>
-        <w:t>图 4-2 门店详情与VR界面截图</w:t>
+        <w:t>图 4-2 门店详情与VR原型真实界面截图</w:t>
       </w:r>
     </w:p>
     <w:p>
@@ -2668,8 +2668,8 @@
       <w:r>
         <w:drawing>
           <wp:inline xmlns:a="http://schemas.openxmlformats.org/drawingml/2006/main" xmlns:pic="http://schemas.openxmlformats.org/drawingml/2006/picture">
-            <wp:extent cx="2331720" cy="4147354"/>
-            <wp:docPr id="4" name="MP-ST-01 仓位选择界面截图" descr="仓位选择界面截图，展示主要字段、状态与操作"/>
+            <wp:extent cx="2331720" cy="4789479"/>
+            <wp:docPr id="4" name="MP-ST-01 仓位选择原型真实界面截图" descr="从迷你仓小程序可交互原型截取的仓位选择实际界面"/>
             <wp:cNvGraphicFramePr>
               <a:graphicFrameLocks noChangeAspect="1"/>
             </wp:cNvGraphicFramePr>
@@ -2689,7 +2689,7 @@
                   <pic:spPr>
                     <a:xfrm>
                       <a:off x="0" y="0"/>
-                      <a:ext cx="2331720" cy="4147354"/>
+                      <a:ext cx="2331720" cy="4789479"/>
                     </a:xfrm>
                     <a:prstGeom prst="rect"/>
                   </pic:spPr>
@@ -2712,7 +2712,7 @@
           <w:color w:val="667085"/>
           <w:sz w:val="17"/>
         </w:rPr>
-        <w:t>图 4-3 仓位选择界面截图</w:t>
+        <w:t>图 4-3 仓位选择原型真实界面截图</w:t>
       </w:r>
     </w:p>
     <w:p>
@@ -3045,8 +3045,8 @@
       <w:r>
         <w:drawing>
           <wp:inline xmlns:a="http://schemas.openxmlformats.org/drawingml/2006/main" xmlns:pic="http://schemas.openxmlformats.org/drawingml/2006/picture">
-            <wp:extent cx="2331720" cy="4147354"/>
-            <wp:docPr id="5" name="MP-ST-01 订单确认与电子签约界面截图" descr="订单确认与电子签约界面截图，展示主要字段、状态与操作"/>
+            <wp:extent cx="2331720" cy="4789479"/>
+            <wp:docPr id="5" name="MP-ST-01 订单确认与电子签约原型真实界面截图" descr="从迷你仓小程序可交互原型截取的订单确认与电子签约实际界面"/>
             <wp:cNvGraphicFramePr>
               <a:graphicFrameLocks noChangeAspect="1"/>
             </wp:cNvGraphicFramePr>
@@ -3066,7 +3066,7 @@
                   <pic:spPr>
                     <a:xfrm>
                       <a:off x="0" y="0"/>
-                      <a:ext cx="2331720" cy="4147354"/>
+                      <a:ext cx="2331720" cy="4789479"/>
                     </a:xfrm>
                     <a:prstGeom prst="rect"/>
                   </pic:spPr>
@@ -3089,7 +3089,7 @@
           <w:color w:val="667085"/>
           <w:sz w:val="17"/>
         </w:rPr>
-        <w:t>图 4-4 订单确认与电子签约界面截图</w:t>
+        <w:t>图 4-4 订单确认与电子签约原型真实界面截图</w:t>
       </w:r>
     </w:p>
     <w:p>
@@ -3422,8 +3422,8 @@
       <w:r>
         <w:drawing>
           <wp:inline xmlns:a="http://schemas.openxmlformats.org/drawingml/2006/main" xmlns:pic="http://schemas.openxmlformats.org/drawingml/2006/picture">
-            <wp:extent cx="2331720" cy="4147354"/>
-            <wp:docPr id="6" name="MP-ST-01 保险与优惠确认界面截图" descr="保险与优惠确认界面截图，展示主要字段、状态与操作"/>
+            <wp:extent cx="2331720" cy="4789479"/>
+            <wp:docPr id="6" name="MP-ST-01 保险与优惠确认原型真实界面截图" descr="从迷你仓小程序可交互原型截取的保险与优惠确认实际界面"/>
             <wp:cNvGraphicFramePr>
               <a:graphicFrameLocks noChangeAspect="1"/>
             </wp:cNvGraphicFramePr>
@@ -3443,7 +3443,7 @@
                   <pic:spPr>
                     <a:xfrm>
                       <a:off x="0" y="0"/>
-                      <a:ext cx="2331720" cy="4147354"/>
+                      <a:ext cx="2331720" cy="4789479"/>
                     </a:xfrm>
                     <a:prstGeom prst="rect"/>
                   </pic:spPr>
@@ -3466,7 +3466,7 @@
           <w:color w:val="667085"/>
           <w:sz w:val="17"/>
         </w:rPr>
-        <w:t>图 4-5 保险与优惠确认界面截图</w:t>
+        <w:t>图 4-5 保险与优惠确认原型真实界面截图</w:t>
       </w:r>
     </w:p>
     <w:p>
@@ -3799,8 +3799,8 @@
       <w:r>
         <w:drawing>
           <wp:inline xmlns:a="http://schemas.openxmlformats.org/drawingml/2006/main" xmlns:pic="http://schemas.openxmlformats.org/drawingml/2006/picture">
-            <wp:extent cx="2331720" cy="4147354"/>
-            <wp:docPr id="7" name="MP-ST-01 统一支付与结果界面截图" descr="统一支付与结果界面截图，展示主要字段、状态与操作"/>
+            <wp:extent cx="2331720" cy="4789479"/>
+            <wp:docPr id="7" name="MP-ST-01 统一支付与结果原型真实界面截图" descr="从迷你仓小程序可交互原型截取的统一支付与结果实际界面"/>
             <wp:cNvGraphicFramePr>
               <a:graphicFrameLocks noChangeAspect="1"/>
             </wp:cNvGraphicFramePr>
@@ -3820,7 +3820,7 @@
                   <pic:spPr>
                     <a:xfrm>
                       <a:off x="0" y="0"/>
-                      <a:ext cx="2331720" cy="4147354"/>
+                      <a:ext cx="2331720" cy="4789479"/>
                     </a:xfrm>
                     <a:prstGeom prst="rect"/>
                   </pic:spPr>
@@ -3843,7 +3843,7 @@
           <w:color w:val="667085"/>
           <w:sz w:val="17"/>
         </w:rPr>
-        <w:t>图 4-6 统一支付与结果界面截图</w:t>
+        <w:t>图 4-6 统一支付与结果原型真实界面截图</w:t>
       </w:r>
     </w:p>
     <w:p>

</xml_diff>